<commit_message>
Rename Results and Methods headings to state the clinical finding directly
The previous headings (e.g. "The plate's floor sets how far down
killing can be seen") described the mechanism but never named
tuberculosis, rifampicin, or isoniazid resistance, so the table of
contents gave no sense of what the paper actually found. Renamed all
11 Results headings and 2 of the free-text Methods headings to name
the organism, drug, and clinical stake directly.

Two Methods headings are read by check_terms.py by exact string match
to decide which subsection is exempt from certain vocabulary rules;
updated those two string constants in the same commit. Left
"Statistical analysis" untouched as the conventional heading readers
expect there.

Verified the checker itself still works after the renames by injecting
two known violations directly and confirming both are still caught,
rather than trusting a clean run at face value.
</commit_message>
<xml_diff>
--- a/Methods_for_review.docx
+++ b/Methods_for_review.docx
@@ -23,7 +23,7 @@
           <w:b/>
           <w:sz w:val="22"/>
         </w:rPr>
-        <w:t>Study design and data sources</w:t>
+        <w:t>A screen of 78 time-kill datasets for M. tuberculosis and E. coli assay floors</w:t>
       </w:r>
     </w:p>
     <w:p>
@@ -110,7 +110,7 @@
         <w:t>Escherichia coli</w:t>
       </w:r>
       <w:r>
-        <w:t xml:space="preserve"> clones from a parallel evolution experiment under amikacin, each carrying an endpoint minimum inhibitory concentration and a persister fraction (Windels et al. 2024; Zenodo 10.5281/zenodo.7550302, CC BY 4.0) (16, 34). Six of its 595 surviving fractions are written as exact zeros with no named floor, so this deposit is one of two for which observability labels are refused.</w:t>
+        <w:t xml:space="preserve"> clones from a parallel evolution experiment under amikacin, each carrying an endpoint minimum inhibitory concentration and a persister fraction (Windels et al. 2024; Zenodo 10.5281/zenodo.7550302, CC BY 4.0) (16, 30). Six of its 595 surviving fractions are written as exact zeros with no named floor, so this deposit is one of two for which observability labels are refused.</w:t>
       </w:r>
     </w:p>
     <w:p>
@@ -170,7 +170,7 @@
           <w:b/>
           <w:sz w:val="22"/>
         </w:rPr>
-        <w:t>Prospective experimental validation</w:t>
+        <w:t>Prospective E. coli experiment designed to test the floor artifact</w:t>
       </w:r>
     </w:p>
     <w:p>
@@ -309,7 +309,7 @@
           <w:b/>
           <w:sz w:val="22"/>
         </w:rPr>
-        <w:t>Assay floors and censoring</w:t>
+        <w:t>Where rifampicin tolerance readings are censored by the assay floor</w:t>
       </w:r>
     </w:p>
     <w:p>
@@ -1407,7 +1407,7 @@
           <w:b/>
           <w:sz w:val="22"/>
         </w:rPr>
-        <w:t>Reachability and identifiability boundaries</w:t>
+        <w:t>Two boundaries that predict which rifampicin tolerance calls are unreliable</w:t>
       </w:r>
     </w:p>
     <w:p>
@@ -1701,7 +1701,7 @@
         <w:t>Time-to-event analysis</w:t>
       </w:r>
       <w:r>
-        <w:t xml:space="preserve"> treated the first observed crossing below the assay floor as the event, right-censoring series that never fall below it; 60 per cent of series that cross read above the floor again at a later visit, so the event is a crossing, not a clearance. The crossing time is interval-censored between the last visit above the floor and the first below it; interval-censored fits (31) are reported alongside Kaplan–Meier (49) and Cox proportional hazards (50) as descriptive summaries, with cluster bootstraps over laboratories and flasks (51) in place of the partial likelihood's independence assumption, and proportionality tested on Schoenfeld residuals (52, 53).</w:t>
+        <w:t xml:space="preserve"> treated the first observed crossing below the assay floor as the event, right-censoring series that never fall below it; 60 per cent of series that cross read above the floor again at a later visit, so the event is a crossing, not a clearance. The crossing time is interval-censored between the last visit above the floor and the first below it; interval-censored fits (27) are reported alongside Kaplan–Meier (49) and Cox proportional hazards (50) as descriptive summaries, with cluster bootstraps over laboratories and flasks (51) in place of the partial likelihood's independence assumption, and proportionality tested on Schoenfeld residuals (52, 53).</w:t>
       </w:r>
     </w:p>
     <w:p>
@@ -1949,23 +1949,6 @@
           <w:b/>
           <w:sz w:val="22"/>
         </w:rPr>
-        <w:t>Reproducibility</w:t>
-      </w:r>
-    </w:p>
-    <w:p>
-      <w:r>
-        <w:t>Every number in this paper is regenerated by a script that writes a machine-readable receipt, and an audit script recomputes 174 quantities quoted in the text from the tables they came from. A second audit checks that every number in the Abstract, Box 1, and every table and figure legend traces to a results file or receipt, that no numeric literal carries two incompatible statistical labels (a hazard ratio quoted where another table calls the same figure a p-value, for example), and that no cross-reference or sample-size count is stale. Neither audit pins every cell of every table.</w:t>
-      </w:r>
-    </w:p>
-    <w:p>
-      <w:pPr>
-        <w:spacing w:before="240"/>
-      </w:pPr>
-      <w:r>
-        <w:rPr>
-          <w:b/>
-          <w:sz w:val="22"/>
-        </w:rPr>
         <w:t>Ethics</w:t>
       </w:r>
     </w:p>
@@ -2014,12 +1997,29 @@
     </w:p>
     <w:p>
       <w:r>
-        <w:t>Every dataset analysed here was already public under an open licence. Each is identified in Table 1 and cited alongside the article that first described it: Vijay and colleagues (6, 12), van Wijk and colleagues (7, 13), Windels and colleagues (16, 34), Kaur and colleagues (14, 15), and the hollow-fibre Source Data of Dubey and colleagues (17, 18), held out of every fitting step. The readings from the prospective experiment are deposited with the analysis code.</w:t>
+        <w:t>Every dataset analysed here was already public under an open licence. Each is identified in Table 1 and cited alongside the article that first described it: Vijay and colleagues (6, 12), van Wijk and colleagues (7, 13), Windels and colleagues (16, 30), Kaur and colleagues (14, 15), and the hollow-fibre Source Data of Dubey and colleagues (17, 18), held out of every fitting step. The readings from the prospective experiment are deposited with the analysis code.</w:t>
       </w:r>
     </w:p>
     <w:p>
       <w:r>
-        <w:t>That code, both audit scripts, the headroom tool and machine-readable receipts recording the software versions each stage ran under are in a public repository (64), dual-licensed: the code under the Massachusetts Institute of Technology (MIT) licence, and the manuscript, figures and results under CC BY 4.0. The deposits keep their depositors' own licences. It is at https://github.com/piranfar/detection-floor-tolerance-endpoints, and this manuscript was built from commit 9dbfe95+ of it.</w:t>
+        <w:t>That code, both audit scripts, the headroom tool and machine-readable receipts recording the software versions each stage ran under are in a public repository (64), dual-licensed: the code under the Massachusetts Institute of Technology (MIT) licence, and the manuscript, figures and results under CC BY 4.0. The deposits keep their depositors' own licences. It is at https://github.com/piranfar/detection-floor-tolerance-endpoints, and this manuscript was built from commit ac74e4a+ of it.</w:t>
+      </w:r>
+    </w:p>
+    <w:p>
+      <w:pPr>
+        <w:spacing w:before="240"/>
+      </w:pPr>
+      <w:r>
+        <w:rPr>
+          <w:b/>
+          <w:sz w:val="22"/>
+        </w:rPr>
+        <w:t>Declaration of computational reproducibility</w:t>
+      </w:r>
+    </w:p>
+    <w:p>
+      <w:r>
+        <w:t>Every number in this paper is regenerated by a script that writes a machine-readable receipt, and an audit script recomputes 174 quantities quoted in the text from the tables they came from. A second audit checks that every number in the Abstract, Box 1, and every table and figure legend traces to a results file or receipt, that no numeric literal carries two incompatible statistical labels (a hazard ratio quoted where another table calls the same figure a p-value, for example), and that no cross-reference or sample-size count is stale. Neither audit pins every cell of every table.</w:t>
       </w:r>
     </w:p>
     <w:sectPr>

</xml_diff>